<commit_message>
Restore light decks dashboard and refresh contract template
</commit_message>
<xml_diff>
--- a/dashboard/contracts/Signature_Package_Services_Contract_Template_April2026.docx
+++ b/dashboard/contracts/Signature_Package_Services_Contract_Template_April2026.docx
@@ -1664,7 +1664,7 @@
           </w:tcPr>
           <w:p>
             <w:r>
-              <w:t>Email, PDF, Loom, or shared reporting view</w:t>
+              <w:t>Email summary plus shared reporting view</w:t>
             </w:r>
           </w:p>
         </w:tc>
@@ -2317,7 +2317,7 @@
     <w:p/>
     <w:p>
       <w:r>
-        <w:t>Scroll Media will deliver a monthly performance report during the first week of each calendar month covering the prior month's performance. Reports may be delivered by email, PDF, Loom, or a comparable shared format. No separate report-review meeting is required unless the Parties agree otherwise in writing.</w:t>
+        <w:t>Scroll Media will deliver a monthly performance report during the first week of each calendar month covering the prior month's performance. Reports are delivered through a shared report link with a brief summary email. No separate report-review meeting is required unless the Parties agree otherwise in writing.</w:t>
       </w:r>
     </w:p>
     <w:p/>

</xml_diff>